<commit_message>
Added new page called Attendance Corrections Inquiry
</commit_message>
<xml_diff>
--- a/Documentation/AI Prompts/Vibe Coding - Extra Time.docx
+++ b/Documentation/AI Prompts/Vibe Coding - Extra Time.docx
@@ -262,6 +262,85 @@
       <w:proofErr w:type="spellEnd"/>
       <w:r>
         <w:t>&gt;</w:t>
+      </w:r>
+    </w:p>
+    <w:p>
+      <w:pPr>
+        <w:spacing w:line="240" w:lineRule="auto"/>
+      </w:pPr>
+    </w:p>
+    <w:p>
+      <w:pPr>
+        <w:rPr>
+          <w:b/>
+          <w:bCs/>
+          <w:color w:val="EE0000"/>
+          <w:u w:val="single"/>
+        </w:rPr>
+      </w:pPr>
+      <w:r>
+        <w:rPr>
+          <w:b/>
+          <w:bCs/>
+          <w:color w:val="EE0000"/>
+          <w:u w:val="single"/>
+        </w:rPr>
+        <w:t>Prompt #</w:t>
+      </w:r>
+      <w:r>
+        <w:rPr>
+          <w:b/>
+          <w:bCs/>
+          <w:color w:val="EE0000"/>
+          <w:u w:val="single"/>
+        </w:rPr>
+        <w:t>2</w:t>
+      </w:r>
+      <w:r>
+        <w:rPr>
+          <w:b/>
+          <w:bCs/>
+          <w:color w:val="EE0000"/>
+          <w:u w:val="single"/>
+        </w:rPr>
+        <w:t>:</w:t>
+      </w:r>
+    </w:p>
+    <w:p>
+      <w:pPr>
+        <w:spacing w:line="240" w:lineRule="auto"/>
+      </w:pPr>
+      <w:r>
+        <w:t>There is a field called “</w:t>
+      </w:r>
+      <w:proofErr w:type="spellStart"/>
+      <w:r>
+        <w:t>WorkDuration</w:t>
+      </w:r>
+      <w:proofErr w:type="spellEnd"/>
+      <w:r>
+        <w:t>” in “</w:t>
+      </w:r>
+      <w:proofErr w:type="spellStart"/>
+      <w:r>
+        <w:t>OTRequestWF</w:t>
+      </w:r>
+      <w:proofErr w:type="spellEnd"/>
+      <w:r>
+        <w:t xml:space="preserve">” table, where data type is integer. It stores the total work duration in terms of minutes. Tell me how to convert the value to time string with the following format: </w:t>
+      </w:r>
+      <w:proofErr w:type="spellStart"/>
+      <w:proofErr w:type="gramStart"/>
+      <w:r>
+        <w:t>HH:mm</w:t>
+      </w:r>
+      <w:proofErr w:type="spellEnd"/>
+      <w:r>
+        <w:t>.</w:t>
+      </w:r>
+      <w:proofErr w:type="gramEnd"/>
+      <w:r>
+        <w:t xml:space="preserve"> Let’s say the value of this field is 490 then the conversion should be, 08:10.</w:t>
       </w:r>
     </w:p>
     <w:sectPr>
@@ -674,6 +753,7 @@
   <w:style w:type="paragraph" w:default="1" w:styleId="Normal">
     <w:name w:val="Normal"/>
     <w:qFormat/>
+    <w:rsid w:val="000C393B"/>
   </w:style>
   <w:style w:type="paragraph" w:styleId="Heading1">
     <w:name w:val="heading 1"/>
@@ -877,6 +957,7 @@
   <w:style w:type="character" w:default="1" w:styleId="DefaultParagraphFont">
     <w:name w:val="Default Paragraph Font"/>
     <w:uiPriority w:val="1"/>
+    <w:semiHidden/>
     <w:unhideWhenUsed/>
   </w:style>
   <w:style w:type="table" w:default="1" w:styleId="TableNormal">

</xml_diff>